<commit_message>
Update my bachelor thesis work
</commit_message>
<xml_diff>
--- a/Bachelor/docx/Thesis_version_1.0.docx
+++ b/Bachelor/docx/Thesis_version_1.0.docx
@@ -1376,7 +1376,7 @@
         <w:sectPr>
           <w:footerReference w:type="default" r:id="rId8"/>
           <w:pgSz w:w="11906" w:h="16838"/>
-          <w:pgMar w:top="1440" w:right="1800" w:bottom="1440" w:left="1800" w:header="851" w:footer="992" w:gutter="0"/>
+          <w:pgMar w:top="1440" w:right="1134" w:bottom="1440" w:left="1531" w:header="851" w:footer="992" w:gutter="0"/>
           <w:pgNumType w:start="0"/>
           <w:cols w:space="720"/>
           <w:titlePg/>
@@ -1603,7 +1603,7 @@
         <w:textAlignment w:val="baseline"/>
       </w:pPr>
       <w:bookmarkStart w:id="3" w:name="_Toc196141859"/>
-      <w:bookmarkStart w:id="4" w:name="_Toc196896476"/>
+      <w:bookmarkStart w:id="4" w:name="_Toc197215957"/>
       <w:r>
         <w:rPr>
           <w:rFonts w:hint="eastAsia"/>
@@ -1649,7 +1649,7 @@
       <w:r>
         <w:fldChar w:fldCharType="separate"/>
       </w:r>
-      <w:hyperlink w:anchor="_Toc196896476" w:history="1">
+      <w:hyperlink w:anchor="_Toc197215957" w:history="1">
         <w:r>
           <w:rPr>
             <w:rStyle w:val="a9"/>
@@ -1684,7 +1684,7 @@
             <w:noProof/>
             <w:webHidden/>
           </w:rPr>
-          <w:instrText xml:space="preserve"> PAGEREF _Toc196896476 \h </w:instrText>
+          <w:instrText xml:space="preserve"> PAGEREF _Toc197215957 \h </w:instrText>
         </w:r>
         <w:r>
           <w:rPr>
@@ -1725,7 +1725,7 @@
           <w14:ligatures w14:val="standardContextual"/>
         </w:rPr>
       </w:pPr>
-      <w:hyperlink w:anchor="_Toc196896477" w:history="1">
+      <w:hyperlink w:anchor="_Toc197215958" w:history="1">
         <w:r>
           <w:rPr>
             <w:rStyle w:val="a9"/>
@@ -1760,7 +1760,7 @@
             <w:noProof/>
             <w:webHidden/>
           </w:rPr>
-          <w:instrText xml:space="preserve"> PAGEREF _Toc196896477 \h </w:instrText>
+          <w:instrText xml:space="preserve"> PAGEREF _Toc197215958 \h </w:instrText>
         </w:r>
         <w:r>
           <w:rPr>
@@ -1801,7 +1801,7 @@
           <w14:ligatures w14:val="standardContextual"/>
         </w:rPr>
       </w:pPr>
-      <w:hyperlink w:anchor="_Toc196896478" w:history="1">
+      <w:hyperlink w:anchor="_Toc197215959" w:history="1">
         <w:r>
           <w:rPr>
             <w:rStyle w:val="a9"/>
@@ -1837,7 +1837,7 @@
             <w:noProof/>
             <w:webHidden/>
           </w:rPr>
-          <w:instrText xml:space="preserve"> PAGEREF _Toc196896478 \h </w:instrText>
+          <w:instrText xml:space="preserve"> PAGEREF _Toc197215959 \h </w:instrText>
         </w:r>
         <w:r>
           <w:rPr>
@@ -1881,7 +1881,7 @@
           <w14:ligatures w14:val="standardContextual"/>
         </w:rPr>
       </w:pPr>
-      <w:hyperlink w:anchor="_Toc196896479" w:history="1">
+      <w:hyperlink w:anchor="_Toc197215960" w:history="1">
         <w:r>
           <w:rPr>
             <w:rStyle w:val="a9"/>
@@ -1924,7 +1924,7 @@
             <w:noProof/>
             <w:webHidden/>
           </w:rPr>
-          <w:instrText xml:space="preserve"> PAGEREF _Toc196896479 \h </w:instrText>
+          <w:instrText xml:space="preserve"> PAGEREF _Toc197215960 \h </w:instrText>
         </w:r>
         <w:r>
           <w:rPr>
@@ -1965,7 +1965,7 @@
           <w14:ligatures w14:val="standardContextual"/>
         </w:rPr>
       </w:pPr>
-      <w:hyperlink w:anchor="_Toc196896480" w:history="1">
+      <w:hyperlink w:anchor="_Toc197215961" w:history="1">
         <w:r>
           <w:rPr>
             <w:rStyle w:val="a9"/>
@@ -2008,7 +2008,7 @@
             <w:noProof/>
             <w:webHidden/>
           </w:rPr>
-          <w:instrText xml:space="preserve"> PAGEREF _Toc196896480 \h </w:instrText>
+          <w:instrText xml:space="preserve"> PAGEREF _Toc197215961 \h </w:instrText>
         </w:r>
         <w:r>
           <w:rPr>
@@ -2053,7 +2053,7 @@
           <w14:ligatures w14:val="standardContextual"/>
         </w:rPr>
       </w:pPr>
-      <w:hyperlink w:anchor="_Toc196896481" w:history="1">
+      <w:hyperlink w:anchor="_Toc197215962" w:history="1">
         <w:r>
           <w:rPr>
             <w:rStyle w:val="a9"/>
@@ -2096,7 +2096,7 @@
             <w:noProof/>
             <w:webHidden/>
           </w:rPr>
-          <w:instrText xml:space="preserve"> PAGEREF _Toc196896481 \h </w:instrText>
+          <w:instrText xml:space="preserve"> PAGEREF _Toc197215962 \h </w:instrText>
         </w:r>
         <w:r>
           <w:rPr>
@@ -2141,7 +2141,7 @@
           <w14:ligatures w14:val="standardContextual"/>
         </w:rPr>
       </w:pPr>
-      <w:hyperlink w:anchor="_Toc196896482" w:history="1">
+      <w:hyperlink w:anchor="_Toc197215963" w:history="1">
         <w:r>
           <w:rPr>
             <w:rStyle w:val="a9"/>
@@ -2184,7 +2184,7 @@
             <w:noProof/>
             <w:webHidden/>
           </w:rPr>
-          <w:instrText xml:space="preserve"> PAGEREF _Toc196896482 \h </w:instrText>
+          <w:instrText xml:space="preserve"> PAGEREF _Toc197215963 \h </w:instrText>
         </w:r>
         <w:r>
           <w:rPr>
@@ -2225,7 +2225,7 @@
           <w14:ligatures w14:val="standardContextual"/>
         </w:rPr>
       </w:pPr>
-      <w:hyperlink w:anchor="_Toc196896483" w:history="1">
+      <w:hyperlink w:anchor="_Toc197215964" w:history="1">
         <w:r>
           <w:rPr>
             <w:rStyle w:val="a9"/>
@@ -2268,7 +2268,7 @@
             <w:noProof/>
             <w:webHidden/>
           </w:rPr>
-          <w:instrText xml:space="preserve"> PAGEREF _Toc196896483 \h </w:instrText>
+          <w:instrText xml:space="preserve"> PAGEREF _Toc197215964 \h </w:instrText>
         </w:r>
         <w:r>
           <w:rPr>
@@ -2313,7 +2313,7 @@
           <w14:ligatures w14:val="standardContextual"/>
         </w:rPr>
       </w:pPr>
-      <w:hyperlink w:anchor="_Toc196896484" w:history="1">
+      <w:hyperlink w:anchor="_Toc197215965" w:history="1">
         <w:r>
           <w:rPr>
             <w:rStyle w:val="a9"/>
@@ -2356,7 +2356,7 @@
             <w:noProof/>
             <w:webHidden/>
           </w:rPr>
-          <w:instrText xml:space="preserve"> PAGEREF _Toc196896484 \h </w:instrText>
+          <w:instrText xml:space="preserve"> PAGEREF _Toc197215965 \h </w:instrText>
         </w:r>
         <w:r>
           <w:rPr>
@@ -2401,7 +2401,7 @@
           <w14:ligatures w14:val="standardContextual"/>
         </w:rPr>
       </w:pPr>
-      <w:hyperlink w:anchor="_Toc196896485" w:history="1">
+      <w:hyperlink w:anchor="_Toc197215966" w:history="1">
         <w:r>
           <w:rPr>
             <w:rStyle w:val="a9"/>
@@ -2444,7 +2444,7 @@
             <w:noProof/>
             <w:webHidden/>
           </w:rPr>
-          <w:instrText xml:space="preserve"> PAGEREF _Toc196896485 \h </w:instrText>
+          <w:instrText xml:space="preserve"> PAGEREF _Toc197215966 \h </w:instrText>
         </w:r>
         <w:r>
           <w:rPr>
@@ -2485,7 +2485,7 @@
           <w14:ligatures w14:val="standardContextual"/>
         </w:rPr>
       </w:pPr>
-      <w:hyperlink w:anchor="_Toc196896486" w:history="1">
+      <w:hyperlink w:anchor="_Toc197215967" w:history="1">
         <w:r>
           <w:rPr>
             <w:rStyle w:val="a9"/>
@@ -2528,7 +2528,7 @@
             <w:noProof/>
             <w:webHidden/>
           </w:rPr>
-          <w:instrText xml:space="preserve"> PAGEREF _Toc196896486 \h </w:instrText>
+          <w:instrText xml:space="preserve"> PAGEREF _Toc197215967 \h </w:instrText>
         </w:r>
         <w:r>
           <w:rPr>
@@ -2569,7 +2569,7 @@
           <w14:ligatures w14:val="standardContextual"/>
         </w:rPr>
       </w:pPr>
-      <w:hyperlink w:anchor="_Toc196896487" w:history="1">
+      <w:hyperlink w:anchor="_Toc197215968" w:history="1">
         <w:r>
           <w:rPr>
             <w:rStyle w:val="a9"/>
@@ -2612,7 +2612,7 @@
             <w:noProof/>
             <w:webHidden/>
           </w:rPr>
-          <w:instrText xml:space="preserve"> PAGEREF _Toc196896487 \h </w:instrText>
+          <w:instrText xml:space="preserve"> PAGEREF _Toc197215968 \h </w:instrText>
         </w:r>
         <w:r>
           <w:rPr>
@@ -2656,7 +2656,7 @@
           <w14:ligatures w14:val="standardContextual"/>
         </w:rPr>
       </w:pPr>
-      <w:hyperlink w:anchor="_Toc196896488" w:history="1">
+      <w:hyperlink w:anchor="_Toc197215969" w:history="1">
         <w:r>
           <w:rPr>
             <w:rStyle w:val="a9"/>
@@ -2699,7 +2699,7 @@
             <w:noProof/>
             <w:webHidden/>
           </w:rPr>
-          <w:instrText xml:space="preserve"> PAGEREF _Toc196896488 \h </w:instrText>
+          <w:instrText xml:space="preserve"> PAGEREF _Toc197215969 \h </w:instrText>
         </w:r>
         <w:r>
           <w:rPr>
@@ -2740,7 +2740,7 @@
           <w14:ligatures w14:val="standardContextual"/>
         </w:rPr>
       </w:pPr>
-      <w:hyperlink w:anchor="_Toc196896489" w:history="1">
+      <w:hyperlink w:anchor="_Toc197215970" w:history="1">
         <w:r>
           <w:rPr>
             <w:rStyle w:val="a9"/>
@@ -2783,7 +2783,7 @@
             <w:noProof/>
             <w:webHidden/>
           </w:rPr>
-          <w:instrText xml:space="preserve"> PAGEREF _Toc196896489 \h </w:instrText>
+          <w:instrText xml:space="preserve"> PAGEREF _Toc197215970 \h </w:instrText>
         </w:r>
         <w:r>
           <w:rPr>
@@ -2828,7 +2828,7 @@
           <w14:ligatures w14:val="standardContextual"/>
         </w:rPr>
       </w:pPr>
-      <w:hyperlink w:anchor="_Toc196896490" w:history="1">
+      <w:hyperlink w:anchor="_Toc197215971" w:history="1">
         <w:r>
           <w:rPr>
             <w:rStyle w:val="a9"/>
@@ -2871,7 +2871,7 @@
             <w:noProof/>
             <w:webHidden/>
           </w:rPr>
-          <w:instrText xml:space="preserve"> PAGEREF _Toc196896490 \h </w:instrText>
+          <w:instrText xml:space="preserve"> PAGEREF _Toc197215971 \h </w:instrText>
         </w:r>
         <w:r>
           <w:rPr>
@@ -2916,7 +2916,7 @@
           <w14:ligatures w14:val="standardContextual"/>
         </w:rPr>
       </w:pPr>
-      <w:hyperlink w:anchor="_Toc196896491" w:history="1">
+      <w:hyperlink w:anchor="_Toc197215972" w:history="1">
         <w:r>
           <w:rPr>
             <w:rStyle w:val="a9"/>
@@ -2959,7 +2959,7 @@
             <w:noProof/>
             <w:webHidden/>
           </w:rPr>
-          <w:instrText xml:space="preserve"> PAGEREF _Toc196896491 \h </w:instrText>
+          <w:instrText xml:space="preserve"> PAGEREF _Toc197215972 \h </w:instrText>
         </w:r>
         <w:r>
           <w:rPr>
@@ -3004,7 +3004,7 @@
           <w14:ligatures w14:val="standardContextual"/>
         </w:rPr>
       </w:pPr>
-      <w:hyperlink w:anchor="_Toc196896492" w:history="1">
+      <w:hyperlink w:anchor="_Toc197215973" w:history="1">
         <w:r>
           <w:rPr>
             <w:rStyle w:val="a9"/>
@@ -3047,7 +3047,7 @@
             <w:noProof/>
             <w:webHidden/>
           </w:rPr>
-          <w:instrText xml:space="preserve"> PAGEREF _Toc196896492 \h </w:instrText>
+          <w:instrText xml:space="preserve"> PAGEREF _Toc197215973 \h </w:instrText>
         </w:r>
         <w:r>
           <w:rPr>
@@ -3088,7 +3088,7 @@
           <w14:ligatures w14:val="standardContextual"/>
         </w:rPr>
       </w:pPr>
-      <w:hyperlink w:anchor="_Toc196896493" w:history="1">
+      <w:hyperlink w:anchor="_Toc197215974" w:history="1">
         <w:r>
           <w:rPr>
             <w:rStyle w:val="a9"/>
@@ -3145,7 +3145,7 @@
             <w:noProof/>
             <w:webHidden/>
           </w:rPr>
-          <w:instrText xml:space="preserve"> PAGEREF _Toc196896493 \h </w:instrText>
+          <w:instrText xml:space="preserve"> PAGEREF _Toc197215974 \h </w:instrText>
         </w:r>
         <w:r>
           <w:rPr>
@@ -3190,7 +3190,7 @@
           <w14:ligatures w14:val="standardContextual"/>
         </w:rPr>
       </w:pPr>
-      <w:hyperlink w:anchor="_Toc196896494" w:history="1">
+      <w:hyperlink w:anchor="_Toc197215975" w:history="1">
         <w:r>
           <w:rPr>
             <w:rStyle w:val="a9"/>
@@ -3254,7 +3254,7 @@
             <w:noProof/>
             <w:webHidden/>
           </w:rPr>
-          <w:instrText xml:space="preserve"> PAGEREF _Toc196896494 \h </w:instrText>
+          <w:instrText xml:space="preserve"> PAGEREF _Toc197215975 \h </w:instrText>
         </w:r>
         <w:r>
           <w:rPr>
@@ -3299,7 +3299,7 @@
           <w14:ligatures w14:val="standardContextual"/>
         </w:rPr>
       </w:pPr>
-      <w:hyperlink w:anchor="_Toc196896495" w:history="1">
+      <w:hyperlink w:anchor="_Toc197215976" w:history="1">
         <w:r>
           <w:rPr>
             <w:rStyle w:val="a9"/>
@@ -3363,7 +3363,7 @@
             <w:noProof/>
             <w:webHidden/>
           </w:rPr>
-          <w:instrText xml:space="preserve"> PAGEREF _Toc196896495 \h </w:instrText>
+          <w:instrText xml:space="preserve"> PAGEREF _Toc197215976 \h </w:instrText>
         </w:r>
         <w:r>
           <w:rPr>
@@ -3408,7 +3408,7 @@
           <w14:ligatures w14:val="standardContextual"/>
         </w:rPr>
       </w:pPr>
-      <w:hyperlink w:anchor="_Toc196896496" w:history="1">
+      <w:hyperlink w:anchor="_Toc197215977" w:history="1">
         <w:r>
           <w:rPr>
             <w:rStyle w:val="a9"/>
@@ -3472,7 +3472,7 @@
             <w:noProof/>
             <w:webHidden/>
           </w:rPr>
-          <w:instrText xml:space="preserve"> PAGEREF _Toc196896496 \h </w:instrText>
+          <w:instrText xml:space="preserve"> PAGEREF _Toc197215977 \h </w:instrText>
         </w:r>
         <w:r>
           <w:rPr>
@@ -3513,7 +3513,7 @@
           <w14:ligatures w14:val="standardContextual"/>
         </w:rPr>
       </w:pPr>
-      <w:hyperlink w:anchor="_Toc196896497" w:history="1">
+      <w:hyperlink w:anchor="_Toc197215978" w:history="1">
         <w:r>
           <w:rPr>
             <w:rStyle w:val="a9"/>
@@ -3584,7 +3584,7 @@
             <w:noProof/>
             <w:webHidden/>
           </w:rPr>
-          <w:instrText xml:space="preserve"> PAGEREF _Toc196896497 \h </w:instrText>
+          <w:instrText xml:space="preserve"> PAGEREF _Toc197215978 \h </w:instrText>
         </w:r>
         <w:r>
           <w:rPr>
@@ -3629,7 +3629,7 @@
           <w14:ligatures w14:val="standardContextual"/>
         </w:rPr>
       </w:pPr>
-      <w:hyperlink w:anchor="_Toc196896498" w:history="1">
+      <w:hyperlink w:anchor="_Toc197215979" w:history="1">
         <w:r>
           <w:rPr>
             <w:rStyle w:val="a9"/>
@@ -3679,7 +3679,7 @@
             <w:noProof/>
             <w:webHidden/>
           </w:rPr>
-          <w:instrText xml:space="preserve"> PAGEREF _Toc196896498 \h </w:instrText>
+          <w:instrText xml:space="preserve"> PAGEREF _Toc197215979 \h </w:instrText>
         </w:r>
         <w:r>
           <w:rPr>
@@ -3724,7 +3724,7 @@
           <w14:ligatures w14:val="standardContextual"/>
         </w:rPr>
       </w:pPr>
-      <w:hyperlink w:anchor="_Toc196896499" w:history="1">
+      <w:hyperlink w:anchor="_Toc197215980" w:history="1">
         <w:r>
           <w:rPr>
             <w:rStyle w:val="a9"/>
@@ -3774,7 +3774,7 @@
             <w:noProof/>
             <w:webHidden/>
           </w:rPr>
-          <w:instrText xml:space="preserve"> PAGEREF _Toc196896499 \h </w:instrText>
+          <w:instrText xml:space="preserve"> PAGEREF _Toc197215980 \h </w:instrText>
         </w:r>
         <w:r>
           <w:rPr>
@@ -3819,7 +3819,7 @@
           <w14:ligatures w14:val="standardContextual"/>
         </w:rPr>
       </w:pPr>
-      <w:hyperlink w:anchor="_Toc196896500" w:history="1">
+      <w:hyperlink w:anchor="_Toc197215981" w:history="1">
         <w:r>
           <w:rPr>
             <w:rStyle w:val="a9"/>
@@ -3862,7 +3862,7 @@
             <w:rStyle w:val="a9"/>
             <w:noProof/>
           </w:rPr>
-          <w:t>的分析目的</w:t>
+          <w:t>的分析设计</w:t>
         </w:r>
         <w:r>
           <w:rPr>
@@ -3883,7 +3883,7 @@
             <w:noProof/>
             <w:webHidden/>
           </w:rPr>
-          <w:instrText xml:space="preserve"> PAGEREF _Toc196896500 \h </w:instrText>
+          <w:instrText xml:space="preserve"> PAGEREF _Toc197215981 \h </w:instrText>
         </w:r>
         <w:r>
           <w:rPr>
@@ -3928,7 +3928,7 @@
           <w14:ligatures w14:val="standardContextual"/>
         </w:rPr>
       </w:pPr>
-      <w:hyperlink w:anchor="_Toc196896501" w:history="1">
+      <w:hyperlink w:anchor="_Toc197215982" w:history="1">
         <w:r>
           <w:rPr>
             <w:rStyle w:val="a9"/>
@@ -3971,7 +3971,7 @@
             <w:rStyle w:val="a9"/>
             <w:noProof/>
           </w:rPr>
-          <w:t>的分析设计</w:t>
+          <w:t>的分析目的</w:t>
         </w:r>
         <w:r>
           <w:rPr>
@@ -3992,7 +3992,7 @@
             <w:noProof/>
             <w:webHidden/>
           </w:rPr>
-          <w:instrText xml:space="preserve"> PAGEREF _Toc196896501 \h </w:instrText>
+          <w:instrText xml:space="preserve"> PAGEREF _Toc197215982 \h </w:instrText>
         </w:r>
         <w:r>
           <w:rPr>
@@ -4036,7 +4036,7 @@
           <w14:ligatures w14:val="standardContextual"/>
         </w:rPr>
       </w:pPr>
-      <w:hyperlink w:anchor="_Toc196896502" w:history="1">
+      <w:hyperlink w:anchor="_Toc197215983" w:history="1">
         <w:r>
           <w:rPr>
             <w:rStyle w:val="a9"/>
@@ -4079,7 +4079,7 @@
             <w:noProof/>
             <w:webHidden/>
           </w:rPr>
-          <w:instrText xml:space="preserve"> PAGEREF _Toc196896502 \h </w:instrText>
+          <w:instrText xml:space="preserve"> PAGEREF _Toc197215983 \h </w:instrText>
         </w:r>
         <w:r>
           <w:rPr>
@@ -4120,7 +4120,7 @@
           <w14:ligatures w14:val="standardContextual"/>
         </w:rPr>
       </w:pPr>
-      <w:hyperlink w:anchor="_Toc196896503" w:history="1">
+      <w:hyperlink w:anchor="_Toc197215984" w:history="1">
         <w:r>
           <w:rPr>
             <w:rStyle w:val="a9"/>
@@ -4163,7 +4163,7 @@
             <w:noProof/>
             <w:webHidden/>
           </w:rPr>
-          <w:instrText xml:space="preserve"> PAGEREF _Toc196896503 \h </w:instrText>
+          <w:instrText xml:space="preserve"> PAGEREF _Toc197215984 \h </w:instrText>
         </w:r>
         <w:r>
           <w:rPr>
@@ -4208,7 +4208,7 @@
           <w14:ligatures w14:val="standardContextual"/>
         </w:rPr>
       </w:pPr>
-      <w:hyperlink w:anchor="_Toc196896504" w:history="1">
+      <w:hyperlink w:anchor="_Toc197215985" w:history="1">
         <w:r>
           <w:rPr>
             <w:rStyle w:val="a9"/>
@@ -4251,7 +4251,7 @@
             <w:noProof/>
             <w:webHidden/>
           </w:rPr>
-          <w:instrText xml:space="preserve"> PAGEREF _Toc196896504 \h </w:instrText>
+          <w:instrText xml:space="preserve"> PAGEREF _Toc197215985 \h </w:instrText>
         </w:r>
         <w:r>
           <w:rPr>
@@ -4296,7 +4296,7 @@
           <w14:ligatures w14:val="standardContextual"/>
         </w:rPr>
       </w:pPr>
-      <w:hyperlink w:anchor="_Toc196896505" w:history="1">
+      <w:hyperlink w:anchor="_Toc197215986" w:history="1">
         <w:r>
           <w:rPr>
             <w:rStyle w:val="a9"/>
@@ -4339,7 +4339,7 @@
             <w:noProof/>
             <w:webHidden/>
           </w:rPr>
-          <w:instrText xml:space="preserve"> PAGEREF _Toc196896505 \h </w:instrText>
+          <w:instrText xml:space="preserve"> PAGEREF _Toc197215986 \h </w:instrText>
         </w:r>
         <w:r>
           <w:rPr>
@@ -4384,7 +4384,7 @@
           <w14:ligatures w14:val="standardContextual"/>
         </w:rPr>
       </w:pPr>
-      <w:hyperlink w:anchor="_Toc196896506" w:history="1">
+      <w:hyperlink w:anchor="_Toc197215987" w:history="1">
         <w:r>
           <w:rPr>
             <w:rStyle w:val="a9"/>
@@ -4427,7 +4427,7 @@
             <w:noProof/>
             <w:webHidden/>
           </w:rPr>
-          <w:instrText xml:space="preserve"> PAGEREF _Toc196896506 \h </w:instrText>
+          <w:instrText xml:space="preserve"> PAGEREF _Toc197215987 \h </w:instrText>
         </w:r>
         <w:r>
           <w:rPr>
@@ -4468,7 +4468,7 @@
           <w14:ligatures w14:val="standardContextual"/>
         </w:rPr>
       </w:pPr>
-      <w:hyperlink w:anchor="_Toc196896507" w:history="1">
+      <w:hyperlink w:anchor="_Toc197215988" w:history="1">
         <w:r>
           <w:rPr>
             <w:rStyle w:val="a9"/>
@@ -4518,7 +4518,7 @@
             <w:noProof/>
             <w:webHidden/>
           </w:rPr>
-          <w:instrText xml:space="preserve"> PAGEREF _Toc196896507 \h </w:instrText>
+          <w:instrText xml:space="preserve"> PAGEREF _Toc197215988 \h </w:instrText>
         </w:r>
         <w:r>
           <w:rPr>
@@ -4563,7 +4563,7 @@
           <w14:ligatures w14:val="standardContextual"/>
         </w:rPr>
       </w:pPr>
-      <w:hyperlink w:anchor="_Toc196896508" w:history="1">
+      <w:hyperlink w:anchor="_Toc197215989" w:history="1">
         <w:r>
           <w:rPr>
             <w:rStyle w:val="a9"/>
@@ -4620,7 +4620,7 @@
             <w:noProof/>
             <w:webHidden/>
           </w:rPr>
-          <w:instrText xml:space="preserve"> PAGEREF _Toc196896508 \h </w:instrText>
+          <w:instrText xml:space="preserve"> PAGEREF _Toc197215989 \h </w:instrText>
         </w:r>
         <w:r>
           <w:rPr>
@@ -4665,7 +4665,7 @@
           <w14:ligatures w14:val="standardContextual"/>
         </w:rPr>
       </w:pPr>
-      <w:hyperlink w:anchor="_Toc196896509" w:history="1">
+      <w:hyperlink w:anchor="_Toc197215990" w:history="1">
         <w:r>
           <w:rPr>
             <w:rStyle w:val="a9"/>
@@ -4687,35 +4687,126 @@
             <w:rStyle w:val="a9"/>
             <w:noProof/>
           </w:rPr>
-          <w:t>确定与个体</w:t>
+          <w:t>与临界点相关</w:t>
         </w:r>
         <w:r>
           <w:rPr>
             <w:rStyle w:val="a9"/>
             <w:noProof/>
           </w:rPr>
-          <w:t>H3N2</w:t>
+          <w:t>DNB</w:t>
         </w:r>
         <w:r>
           <w:rPr>
             <w:rStyle w:val="a9"/>
             <w:noProof/>
           </w:rPr>
-          <w:t>流感临界点有关的</w:t>
-        </w:r>
+          <w:t>模块与通路分析</w:t>
+        </w:r>
+        <w:r>
+          <w:rPr>
+            <w:noProof/>
+            <w:webHidden/>
+          </w:rPr>
+          <w:tab/>
+        </w:r>
+        <w:r>
+          <w:rPr>
+            <w:noProof/>
+            <w:webHidden/>
+          </w:rPr>
+          <w:fldChar w:fldCharType="begin"/>
+        </w:r>
+        <w:r>
+          <w:rPr>
+            <w:noProof/>
+            <w:webHidden/>
+          </w:rPr>
+          <w:instrText xml:space="preserve"> PAGEREF _Toc197215990 \h </w:instrText>
+        </w:r>
+        <w:r>
+          <w:rPr>
+            <w:noProof/>
+            <w:webHidden/>
+          </w:rPr>
+        </w:r>
+        <w:r>
+          <w:rPr>
+            <w:noProof/>
+            <w:webHidden/>
+          </w:rPr>
+          <w:fldChar w:fldCharType="separate"/>
+        </w:r>
+        <w:r>
+          <w:rPr>
+            <w:noProof/>
+            <w:webHidden/>
+          </w:rPr>
+          <w:t>7</w:t>
+        </w:r>
+        <w:r>
+          <w:rPr>
+            <w:noProof/>
+            <w:webHidden/>
+          </w:rPr>
+          <w:fldChar w:fldCharType="end"/>
+        </w:r>
+      </w:hyperlink>
+    </w:p>
+    <w:p>
+      <w:pPr>
+        <w:pStyle w:val="TOC2"/>
+        <w:rPr>
+          <w:rFonts w:asciiTheme="minorHAnsi" w:eastAsiaTheme="minorEastAsia" w:hAnsiTheme="minorHAnsi" w:cstheme="minorBidi"/>
+          <w:noProof/>
+          <w:sz w:val="22"/>
+          <w14:ligatures w14:val="standardContextual"/>
+        </w:rPr>
+      </w:pPr>
+      <w:hyperlink w:anchor="_Toc197215991" w:history="1">
         <w:r>
           <w:rPr>
             <w:rStyle w:val="a9"/>
             <w:noProof/>
           </w:rPr>
-          <w:t>DNB</w:t>
+          <w:t>3.3</w:t>
+        </w:r>
+        <w:r>
+          <w:rPr>
+            <w:rFonts w:asciiTheme="minorHAnsi" w:eastAsiaTheme="minorEastAsia" w:hAnsiTheme="minorHAnsi" w:cstheme="minorBidi"/>
+            <w:noProof/>
+            <w:sz w:val="22"/>
+            <w14:ligatures w14:val="standardContextual"/>
+          </w:rPr>
+          <w:tab/>
         </w:r>
         <w:r>
           <w:rPr>
             <w:rStyle w:val="a9"/>
             <w:noProof/>
           </w:rPr>
-          <w:t>模块</w:t>
+          <w:t>TCGA-READ</w:t>
+        </w:r>
+        <w:r>
+          <w:rPr>
+            <w:rStyle w:val="a9"/>
+            <w:noProof/>
+          </w:rPr>
+          <w:t>与</w:t>
+        </w:r>
+        <w:r>
+          <w:rPr>
+            <w:rStyle w:val="a9"/>
+            <w:noProof/>
+          </w:rPr>
+          <w:t>TCGA-COAD</w:t>
+        </w:r>
+        <w:r>
+          <w:rPr>
+            <w:rStyle w:val="a9"/>
+            <w:noProof/>
+          </w:rPr>
+          <w:t>的因果网络熵分析结果</w:t>
         </w:r>
         <w:r>
           <w:rPr>
@@ -4736,7 +4827,7 @@
             <w:noProof/>
             <w:webHidden/>
           </w:rPr>
-          <w:instrText xml:space="preserve"> PAGEREF _Toc196896509 \h </w:instrText>
+          <w:instrText xml:space="preserve"> PAGEREF _Toc197215991 \h </w:instrText>
         </w:r>
         <w:r>
           <w:rPr>
@@ -4781,13 +4872,13 @@
           <w14:ligatures w14:val="standardContextual"/>
         </w:rPr>
       </w:pPr>
-      <w:hyperlink w:anchor="_Toc196896510" w:history="1">
+      <w:hyperlink w:anchor="_Toc197215992" w:history="1">
         <w:r>
           <w:rPr>
             <w:rStyle w:val="a9"/>
             <w:noProof/>
           </w:rPr>
-          <w:t>3.2.3</w:t>
+          <w:t>3.3.1</w:t>
         </w:r>
         <w:r>
           <w:rPr>
@@ -4803,7 +4894,35 @@
             <w:rStyle w:val="a9"/>
             <w:noProof/>
           </w:rPr>
-          <w:t>与临界点相关生物标志物与通路分析</w:t>
+          <w:t>识别</w:t>
+        </w:r>
+        <w:r>
+          <w:rPr>
+            <w:rStyle w:val="a9"/>
+            <w:noProof/>
+          </w:rPr>
+          <w:t>TCGA-READ</w:t>
+        </w:r>
+        <w:r>
+          <w:rPr>
+            <w:rStyle w:val="a9"/>
+            <w:noProof/>
+          </w:rPr>
+          <w:t>及</w:t>
+        </w:r>
+        <w:r>
+          <w:rPr>
+            <w:rStyle w:val="a9"/>
+            <w:noProof/>
+          </w:rPr>
+          <w:t>TCGA-COAD</w:t>
+        </w:r>
+        <w:r>
+          <w:rPr>
+            <w:rStyle w:val="a9"/>
+            <w:noProof/>
+          </w:rPr>
+          <w:t>的恶化前状态的分期阶段</w:t>
         </w:r>
         <w:r>
           <w:rPr>
@@ -4824,112 +4943,7 @@
             <w:noProof/>
             <w:webHidden/>
           </w:rPr>
-          <w:instrText xml:space="preserve"> PAGEREF _Toc196896510 \h </w:instrText>
-        </w:r>
-        <w:r>
-          <w:rPr>
-            <w:noProof/>
-            <w:webHidden/>
-          </w:rPr>
-        </w:r>
-        <w:r>
-          <w:rPr>
-            <w:noProof/>
-            <w:webHidden/>
-          </w:rPr>
-          <w:fldChar w:fldCharType="separate"/>
-        </w:r>
-        <w:r>
-          <w:rPr>
-            <w:noProof/>
-            <w:webHidden/>
-          </w:rPr>
-          <w:t>7</w:t>
-        </w:r>
-        <w:r>
-          <w:rPr>
-            <w:noProof/>
-            <w:webHidden/>
-          </w:rPr>
-          <w:fldChar w:fldCharType="end"/>
-        </w:r>
-      </w:hyperlink>
-    </w:p>
-    <w:p>
-      <w:pPr>
-        <w:pStyle w:val="TOC2"/>
-        <w:rPr>
-          <w:rFonts w:asciiTheme="minorHAnsi" w:eastAsiaTheme="minorEastAsia" w:hAnsiTheme="minorHAnsi" w:cstheme="minorBidi"/>
-          <w:noProof/>
-          <w:sz w:val="22"/>
-          <w14:ligatures w14:val="standardContextual"/>
-        </w:rPr>
-      </w:pPr>
-      <w:hyperlink w:anchor="_Toc196896511" w:history="1">
-        <w:r>
-          <w:rPr>
-            <w:rStyle w:val="a9"/>
-            <w:noProof/>
-          </w:rPr>
-          <w:t>3.3</w:t>
-        </w:r>
-        <w:r>
-          <w:rPr>
-            <w:rFonts w:asciiTheme="minorHAnsi" w:eastAsiaTheme="minorEastAsia" w:hAnsiTheme="minorHAnsi" w:cstheme="minorBidi"/>
-            <w:noProof/>
-            <w:sz w:val="22"/>
-            <w14:ligatures w14:val="standardContextual"/>
-          </w:rPr>
-          <w:tab/>
-        </w:r>
-        <w:r>
-          <w:rPr>
-            <w:rStyle w:val="a9"/>
-            <w:noProof/>
-          </w:rPr>
-          <w:t>TCGA-READ</w:t>
-        </w:r>
-        <w:r>
-          <w:rPr>
-            <w:rStyle w:val="a9"/>
-            <w:noProof/>
-          </w:rPr>
-          <w:t>与</w:t>
-        </w:r>
-        <w:r>
-          <w:rPr>
-            <w:rStyle w:val="a9"/>
-            <w:noProof/>
-          </w:rPr>
-          <w:t>TCGA-COAD</w:t>
-        </w:r>
-        <w:r>
-          <w:rPr>
-            <w:rStyle w:val="a9"/>
-            <w:noProof/>
-          </w:rPr>
-          <w:t>的因果网络熵分析结果</w:t>
-        </w:r>
-        <w:r>
-          <w:rPr>
-            <w:noProof/>
-            <w:webHidden/>
-          </w:rPr>
-          <w:tab/>
-        </w:r>
-        <w:r>
-          <w:rPr>
-            <w:noProof/>
-            <w:webHidden/>
-          </w:rPr>
-          <w:fldChar w:fldCharType="begin"/>
-        </w:r>
-        <w:r>
-          <w:rPr>
-            <w:noProof/>
-            <w:webHidden/>
-          </w:rPr>
-          <w:instrText xml:space="preserve"> PAGEREF _Toc196896511 \h </w:instrText>
+          <w:instrText xml:space="preserve"> PAGEREF _Toc197215992 \h </w:instrText>
         </w:r>
         <w:r>
           <w:rPr>
@@ -4974,13 +4988,13 @@
           <w14:ligatures w14:val="standardContextual"/>
         </w:rPr>
       </w:pPr>
-      <w:hyperlink w:anchor="_Toc196896512" w:history="1">
+      <w:hyperlink w:anchor="_Toc197215993" w:history="1">
         <w:r>
           <w:rPr>
             <w:rStyle w:val="a9"/>
             <w:noProof/>
           </w:rPr>
-          <w:t>3.3.1</w:t>
+          <w:t>3.3.2</w:t>
         </w:r>
         <w:r>
           <w:rPr>
@@ -4996,35 +5010,7 @@
             <w:rStyle w:val="a9"/>
             <w:noProof/>
           </w:rPr>
-          <w:t>识别</w:t>
-        </w:r>
-        <w:r>
-          <w:rPr>
-            <w:rStyle w:val="a9"/>
-            <w:noProof/>
-          </w:rPr>
-          <w:t>TCGA-READ</w:t>
-        </w:r>
-        <w:r>
-          <w:rPr>
-            <w:rStyle w:val="a9"/>
-            <w:noProof/>
-          </w:rPr>
-          <w:t>及</w:t>
-        </w:r>
-        <w:r>
-          <w:rPr>
-            <w:rStyle w:val="a9"/>
-            <w:noProof/>
-          </w:rPr>
-          <w:t>TCGA-COAD</w:t>
-        </w:r>
-        <w:r>
-          <w:rPr>
-            <w:rStyle w:val="a9"/>
-            <w:noProof/>
-          </w:rPr>
-          <w:t>的恶化前状态的分期阶段</w:t>
+          <w:t>临界点前后的生存差异</w:t>
         </w:r>
         <w:r>
           <w:rPr>
@@ -5045,7 +5031,7 @@
             <w:noProof/>
             <w:webHidden/>
           </w:rPr>
-          <w:instrText xml:space="preserve"> PAGEREF _Toc196896512 \h </w:instrText>
+          <w:instrText xml:space="preserve"> PAGEREF _Toc197215993 \h </w:instrText>
         </w:r>
         <w:r>
           <w:rPr>
@@ -5090,13 +5076,13 @@
           <w14:ligatures w14:val="standardContextual"/>
         </w:rPr>
       </w:pPr>
-      <w:hyperlink w:anchor="_Toc196896513" w:history="1">
+      <w:hyperlink w:anchor="_Toc197215994" w:history="1">
         <w:r>
           <w:rPr>
             <w:rStyle w:val="a9"/>
             <w:noProof/>
           </w:rPr>
-          <w:t>3.3.2</w:t>
+          <w:t>3.3.3</w:t>
         </w:r>
         <w:r>
           <w:rPr>
@@ -5112,49 +5098,21 @@
             <w:rStyle w:val="a9"/>
             <w:noProof/>
           </w:rPr>
-          <w:t>确定与</w:t>
+          <w:t>与临界点相关</w:t>
         </w:r>
         <w:r>
           <w:rPr>
             <w:rStyle w:val="a9"/>
             <w:noProof/>
           </w:rPr>
-          <w:t>TCGA-READ</w:t>
+          <w:t>DNB</w:t>
         </w:r>
         <w:r>
           <w:rPr>
             <w:rStyle w:val="a9"/>
             <w:noProof/>
           </w:rPr>
-          <w:t>及</w:t>
-        </w:r>
-        <w:r>
-          <w:rPr>
-            <w:rStyle w:val="a9"/>
-            <w:noProof/>
-          </w:rPr>
-          <w:t>TCGA-COAD</w:t>
-        </w:r>
-        <w:r>
-          <w:rPr>
-            <w:rStyle w:val="a9"/>
-            <w:noProof/>
-          </w:rPr>
-          <w:t>临界点有关的</w:t>
-        </w:r>
-        <w:r>
-          <w:rPr>
-            <w:rStyle w:val="a9"/>
-            <w:noProof/>
-          </w:rPr>
-          <w:t>DNB</w:t>
-        </w:r>
-        <w:r>
-          <w:rPr>
-            <w:rStyle w:val="a9"/>
-            <w:noProof/>
-          </w:rPr>
-          <w:t>模块</w:t>
+          <w:t>模块与通路分析</w:t>
         </w:r>
         <w:r>
           <w:rPr>
@@ -5175,7 +5133,7 @@
             <w:noProof/>
             <w:webHidden/>
           </w:rPr>
-          <w:instrText xml:space="preserve"> PAGEREF _Toc196896513 \h </w:instrText>
+          <w:instrText xml:space="preserve"> PAGEREF _Toc197215994 \h </w:instrText>
         </w:r>
         <w:r>
           <w:rPr>
@@ -5208,10 +5166,9 @@
     </w:p>
     <w:p>
       <w:pPr>
-        <w:pStyle w:val="TOC3"/>
+        <w:pStyle w:val="TOC1"/>
         <w:tabs>
-          <w:tab w:val="left" w:pos="880"/>
-          <w:tab w:val="right" w:leader="dot" w:pos="9231"/>
+          <w:tab w:val="left" w:pos="1100"/>
         </w:tabs>
         <w:rPr>
           <w:rFonts w:asciiTheme="minorHAnsi" w:eastAsiaTheme="minorEastAsia" w:hAnsiTheme="minorHAnsi" w:cstheme="minorBidi"/>
@@ -5220,13 +5177,13 @@
           <w14:ligatures w14:val="standardContextual"/>
         </w:rPr>
       </w:pPr>
-      <w:hyperlink w:anchor="_Toc196896514" w:history="1">
+      <w:hyperlink w:anchor="_Toc197215995" w:history="1">
         <w:r>
           <w:rPr>
             <w:rStyle w:val="a9"/>
             <w:noProof/>
           </w:rPr>
-          <w:t>3.3.3</w:t>
+          <w:t>第四章</w:t>
         </w:r>
         <w:r>
           <w:rPr>
@@ -5242,7 +5199,7 @@
             <w:rStyle w:val="a9"/>
             <w:noProof/>
           </w:rPr>
-          <w:t>临界点前后的生存差异</w:t>
+          <w:t>论文总结</w:t>
         </w:r>
         <w:r>
           <w:rPr>
@@ -5263,7 +5220,7 @@
             <w:noProof/>
             <w:webHidden/>
           </w:rPr>
-          <w:instrText xml:space="preserve"> PAGEREF _Toc196896514 \h </w:instrText>
+          <w:instrText xml:space="preserve"> PAGEREF _Toc197215995 \h </w:instrText>
         </w:r>
         <w:r>
           <w:rPr>
@@ -5283,7 +5240,7 @@
             <w:noProof/>
             <w:webHidden/>
           </w:rPr>
-          <w:t>7</w:t>
+          <w:t>8</w:t>
         </w:r>
         <w:r>
           <w:rPr>
@@ -5296,11 +5253,7 @@
     </w:p>
     <w:p>
       <w:pPr>
-        <w:pStyle w:val="TOC3"/>
-        <w:tabs>
-          <w:tab w:val="left" w:pos="880"/>
-          <w:tab w:val="right" w:leader="dot" w:pos="9231"/>
-        </w:tabs>
+        <w:pStyle w:val="TOC1"/>
         <w:rPr>
           <w:rFonts w:asciiTheme="minorHAnsi" w:eastAsiaTheme="minorEastAsia" w:hAnsiTheme="minorHAnsi" w:cstheme="minorBidi"/>
           <w:noProof/>
@@ -5308,39 +5261,23 @@
           <w14:ligatures w14:val="standardContextual"/>
         </w:rPr>
       </w:pPr>
-      <w:hyperlink w:anchor="_Toc196896515" w:history="1">
+      <w:hyperlink w:anchor="_Toc197215996" w:history="1">
         <w:r>
           <w:rPr>
             <w:rStyle w:val="a9"/>
             <w:noProof/>
           </w:rPr>
-          <w:t>3.3.4</w:t>
-        </w:r>
-        <w:r>
-          <w:rPr>
-            <w:rFonts w:asciiTheme="minorHAnsi" w:eastAsiaTheme="minorEastAsia" w:hAnsiTheme="minorHAnsi" w:cstheme="minorBidi"/>
-            <w:noProof/>
-            <w:sz w:val="22"/>
-            <w14:ligatures w14:val="standardContextual"/>
+          <w:t>参考文献</w:t>
+        </w:r>
+        <w:r>
+          <w:rPr>
+            <w:noProof/>
+            <w:webHidden/>
           </w:rPr>
           <w:tab/>
         </w:r>
         <w:r>
           <w:rPr>
-            <w:rStyle w:val="a9"/>
-            <w:noProof/>
-          </w:rPr>
-          <w:t>与临界点相关生物标志物与通路分析</w:t>
-        </w:r>
-        <w:r>
-          <w:rPr>
-            <w:noProof/>
-            <w:webHidden/>
-          </w:rPr>
-          <w:tab/>
-        </w:r>
-        <w:r>
-          <w:rPr>
             <w:noProof/>
             <w:webHidden/>
           </w:rPr>
@@ -5351,7 +5288,7 @@
             <w:noProof/>
             <w:webHidden/>
           </w:rPr>
-          <w:instrText xml:space="preserve"> PAGEREF _Toc196896515 \h </w:instrText>
+          <w:instrText xml:space="preserve"> PAGEREF _Toc197215996 \h </w:instrText>
         </w:r>
         <w:r>
           <w:rPr>
@@ -5371,7 +5308,7 @@
             <w:noProof/>
             <w:webHidden/>
           </w:rPr>
-          <w:t>7</w:t>
+          <w:t>9</w:t>
         </w:r>
         <w:r>
           <w:rPr>
@@ -5385,9 +5322,6 @@
     <w:p>
       <w:pPr>
         <w:pStyle w:val="TOC1"/>
-        <w:tabs>
-          <w:tab w:val="left" w:pos="1100"/>
-        </w:tabs>
         <w:rPr>
           <w:rFonts w:asciiTheme="minorHAnsi" w:eastAsiaTheme="minorEastAsia" w:hAnsiTheme="minorHAnsi" w:cstheme="minorBidi"/>
           <w:noProof/>
@@ -5395,39 +5329,32 @@
           <w14:ligatures w14:val="standardContextual"/>
         </w:rPr>
       </w:pPr>
-      <w:hyperlink w:anchor="_Toc196896516" w:history="1">
+      <w:hyperlink w:anchor="_Toc197215997" w:history="1">
         <w:r>
           <w:rPr>
             <w:rStyle w:val="a9"/>
             <w:noProof/>
-          </w:rPr>
-          <w:t>第四章</w:t>
-        </w:r>
-        <w:r>
-          <w:rPr>
-            <w:rFonts w:asciiTheme="minorHAnsi" w:eastAsiaTheme="minorEastAsia" w:hAnsiTheme="minorHAnsi" w:cstheme="minorBidi"/>
-            <w:noProof/>
-            <w:sz w:val="22"/>
-            <w14:ligatures w14:val="standardContextual"/>
+            <w:spacing w:val="315"/>
+          </w:rPr>
+          <w:t>致</w:t>
+        </w:r>
+        <w:r>
+          <w:rPr>
+            <w:rStyle w:val="a9"/>
+            <w:noProof/>
+            <w:spacing w:val="7"/>
+          </w:rPr>
+          <w:t>谢</w:t>
+        </w:r>
+        <w:r>
+          <w:rPr>
+            <w:noProof/>
+            <w:webHidden/>
           </w:rPr>
           <w:tab/>
         </w:r>
         <w:r>
           <w:rPr>
-            <w:rStyle w:val="a9"/>
-            <w:noProof/>
-          </w:rPr>
-          <w:t>论文总结</w:t>
-        </w:r>
-        <w:r>
-          <w:rPr>
-            <w:noProof/>
-            <w:webHidden/>
-          </w:rPr>
-          <w:tab/>
-        </w:r>
-        <w:r>
-          <w:rPr>
             <w:noProof/>
             <w:webHidden/>
           </w:rPr>
@@ -5438,152 +5365,7 @@
             <w:noProof/>
             <w:webHidden/>
           </w:rPr>
-          <w:instrText xml:space="preserve"> PAGEREF _Toc196896516 \h </w:instrText>
-        </w:r>
-        <w:r>
-          <w:rPr>
-            <w:noProof/>
-            <w:webHidden/>
-          </w:rPr>
-        </w:r>
-        <w:r>
-          <w:rPr>
-            <w:noProof/>
-            <w:webHidden/>
-          </w:rPr>
-          <w:fldChar w:fldCharType="separate"/>
-        </w:r>
-        <w:r>
-          <w:rPr>
-            <w:noProof/>
-            <w:webHidden/>
-          </w:rPr>
-          <w:t>8</w:t>
-        </w:r>
-        <w:r>
-          <w:rPr>
-            <w:noProof/>
-            <w:webHidden/>
-          </w:rPr>
-          <w:fldChar w:fldCharType="end"/>
-        </w:r>
-      </w:hyperlink>
-    </w:p>
-    <w:p>
-      <w:pPr>
-        <w:pStyle w:val="TOC1"/>
-        <w:rPr>
-          <w:rFonts w:asciiTheme="minorHAnsi" w:eastAsiaTheme="minorEastAsia" w:hAnsiTheme="minorHAnsi" w:cstheme="minorBidi"/>
-          <w:noProof/>
-          <w:sz w:val="22"/>
-          <w14:ligatures w14:val="standardContextual"/>
-        </w:rPr>
-      </w:pPr>
-      <w:hyperlink w:anchor="_Toc196896517" w:history="1">
-        <w:r>
-          <w:rPr>
-            <w:rStyle w:val="a9"/>
-            <w:noProof/>
-          </w:rPr>
-          <w:t>参考文献</w:t>
-        </w:r>
-        <w:r>
-          <w:rPr>
-            <w:noProof/>
-            <w:webHidden/>
-          </w:rPr>
-          <w:tab/>
-        </w:r>
-        <w:r>
-          <w:rPr>
-            <w:noProof/>
-            <w:webHidden/>
-          </w:rPr>
-          <w:fldChar w:fldCharType="begin"/>
-        </w:r>
-        <w:r>
-          <w:rPr>
-            <w:noProof/>
-            <w:webHidden/>
-          </w:rPr>
-          <w:instrText xml:space="preserve"> PAGEREF _Toc196896517 \h </w:instrText>
-        </w:r>
-        <w:r>
-          <w:rPr>
-            <w:noProof/>
-            <w:webHidden/>
-          </w:rPr>
-        </w:r>
-        <w:r>
-          <w:rPr>
-            <w:noProof/>
-            <w:webHidden/>
-          </w:rPr>
-          <w:fldChar w:fldCharType="separate"/>
-        </w:r>
-        <w:r>
-          <w:rPr>
-            <w:noProof/>
-            <w:webHidden/>
-          </w:rPr>
-          <w:t>9</w:t>
-        </w:r>
-        <w:r>
-          <w:rPr>
-            <w:noProof/>
-            <w:webHidden/>
-          </w:rPr>
-          <w:fldChar w:fldCharType="end"/>
-        </w:r>
-      </w:hyperlink>
-    </w:p>
-    <w:p>
-      <w:pPr>
-        <w:pStyle w:val="TOC1"/>
-        <w:rPr>
-          <w:rFonts w:asciiTheme="minorHAnsi" w:eastAsiaTheme="minorEastAsia" w:hAnsiTheme="minorHAnsi" w:cstheme="minorBidi"/>
-          <w:noProof/>
-          <w:sz w:val="22"/>
-          <w14:ligatures w14:val="standardContextual"/>
-        </w:rPr>
-      </w:pPr>
-      <w:hyperlink w:anchor="_Toc196896518" w:history="1">
-        <w:r>
-          <w:rPr>
-            <w:rStyle w:val="a9"/>
-            <w:noProof/>
-            <w:spacing w:val="315"/>
-          </w:rPr>
-          <w:t>致</w:t>
-        </w:r>
-        <w:r>
-          <w:rPr>
-            <w:rStyle w:val="a9"/>
-            <w:noProof/>
-            <w:spacing w:val="7"/>
-          </w:rPr>
-          <w:t>谢</w:t>
-        </w:r>
-        <w:r>
-          <w:rPr>
-            <w:noProof/>
-            <w:webHidden/>
-          </w:rPr>
-          <w:tab/>
-        </w:r>
-        <w:r>
-          <w:rPr>
-            <w:noProof/>
-            <w:webHidden/>
-          </w:rPr>
-          <w:fldChar w:fldCharType="begin"/>
-        </w:r>
-        <w:r>
-          <w:rPr>
-            <w:noProof/>
-            <w:webHidden/>
-          </w:rPr>
-          <w:instrText xml:space="preserve"> PAGEREF _Toc196896518 \h </w:instrText>
+          <w:instrText xml:space="preserve"> PAGEREF _Toc197215997 \h </w:instrText>
         </w:r>
         <w:r>
           <w:rPr>
@@ -5644,7 +5426,7 @@
         <w:pStyle w:val="af"/>
         <w:textAlignment w:val="baseline"/>
       </w:pPr>
-      <w:bookmarkStart w:id="5" w:name="_Toc196896477"/>
+      <w:bookmarkStart w:id="5" w:name="_Toc197215958"/>
       <w:r>
         <w:rPr>
           <w:rFonts w:hint="eastAsia"/>
@@ -5683,7 +5465,7 @@
         </w:rPr>
       </w:pPr>
       <w:bookmarkStart w:id="6" w:name="_Toc196141860"/>
-      <w:bookmarkStart w:id="7" w:name="_Toc196896478"/>
+      <w:bookmarkStart w:id="7" w:name="_Toc197215959"/>
       <w:r>
         <w:rPr>
           <w:rFonts w:ascii="Times New Roman" w:hAnsi="Times New Roman"/>
@@ -5726,7 +5508,7 @@
         <w:spacing w:after="312"/>
         <w:textAlignment w:val="baseline"/>
       </w:pPr>
-      <w:bookmarkStart w:id="8" w:name="_Toc196896479"/>
+      <w:bookmarkStart w:id="8" w:name="_Toc197215960"/>
       <w:r>
         <w:rPr>
           <w:rFonts w:hint="eastAsia"/>
@@ -5742,7 +5524,7 @@
         <w:spacing w:before="156" w:after="156"/>
         <w:textAlignment w:val="baseline"/>
       </w:pPr>
-      <w:bookmarkStart w:id="9" w:name="_Toc196896480"/>
+      <w:bookmarkStart w:id="9" w:name="_Toc197215961"/>
       <w:r>
         <w:rPr>
           <w:rFonts w:hint="eastAsia"/>
@@ -5768,7 +5550,7 @@
         <w:pStyle w:val="3"/>
         <w:textAlignment w:val="baseline"/>
       </w:pPr>
-      <w:bookmarkStart w:id="10" w:name="_Toc196896481"/>
+      <w:bookmarkStart w:id="10" w:name="_Toc197215962"/>
       <w:r>
         <w:t>选题背景</w:t>
       </w:r>
@@ -5906,7 +5688,7 @@
         <w:pStyle w:val="3"/>
         <w:textAlignment w:val="baseline"/>
       </w:pPr>
-      <w:bookmarkStart w:id="11" w:name="_Toc196896482"/>
+      <w:bookmarkStart w:id="11" w:name="_Toc197215963"/>
       <w:r>
         <w:t>研究</w:t>
       </w:r>
@@ -5976,7 +5758,7 @@
         <w:spacing w:before="156" w:after="156"/>
         <w:textAlignment w:val="baseline"/>
       </w:pPr>
-      <w:bookmarkStart w:id="12" w:name="_Toc196896483"/>
+      <w:bookmarkStart w:id="12" w:name="_Toc197215964"/>
       <w:r>
         <w:rPr>
           <w:rFonts w:hint="eastAsia"/>
@@ -6002,7 +5784,7 @@
         <w:pStyle w:val="3"/>
         <w:textAlignment w:val="baseline"/>
       </w:pPr>
-      <w:bookmarkStart w:id="13" w:name="_Toc196896484"/>
+      <w:bookmarkStart w:id="13" w:name="_Toc197215965"/>
       <w:r>
         <w:rPr>
           <w:rFonts w:hint="eastAsia"/>
@@ -6477,7 +6259,7 @@
         <w:pStyle w:val="3"/>
         <w:textAlignment w:val="baseline"/>
       </w:pPr>
-      <w:bookmarkStart w:id="14" w:name="_Toc196896485"/>
+      <w:bookmarkStart w:id="14" w:name="_Toc197215966"/>
       <w:r>
         <w:rPr>
           <w:rFonts w:hint="eastAsia"/>
@@ -10189,7 +9971,7 @@
         <w:spacing w:before="156" w:after="156"/>
         <w:textAlignment w:val="baseline"/>
       </w:pPr>
-      <w:bookmarkStart w:id="15" w:name="_Toc196896486"/>
+      <w:bookmarkStart w:id="15" w:name="_Toc197215967"/>
       <w:r>
         <w:rPr>
           <w:rFonts w:hint="eastAsia"/>
@@ -10210,7 +9992,7 @@
         <w:spacing w:before="156" w:after="156"/>
         <w:textAlignment w:val="baseline"/>
       </w:pPr>
-      <w:bookmarkStart w:id="16" w:name="_Toc196896487"/>
+      <w:bookmarkStart w:id="16" w:name="_Toc197215968"/>
       <w:r>
         <w:rPr>
           <w:rFonts w:hint="eastAsia"/>
@@ -10246,7 +10028,7 @@
           <w:rFonts w:ascii="黑体" w:hAnsi="黑体"/>
         </w:rPr>
       </w:pPr>
-      <w:bookmarkStart w:id="17" w:name="_Toc196896488"/>
+      <w:bookmarkStart w:id="17" w:name="_Toc197215969"/>
       <w:r>
         <w:rPr>
           <w:rFonts w:hint="eastAsia"/>
@@ -10262,7 +10044,7 @@
         <w:spacing w:before="156" w:after="156"/>
         <w:textAlignment w:val="baseline"/>
       </w:pPr>
-      <w:bookmarkStart w:id="18" w:name="_Toc196896489"/>
+      <w:bookmarkStart w:id="18" w:name="_Toc197215970"/>
       <w:r>
         <w:rPr>
           <w:rFonts w:hint="eastAsia"/>
@@ -10285,7 +10067,7 @@
         <w:pStyle w:val="3"/>
         <w:textAlignment w:val="baseline"/>
       </w:pPr>
-      <w:bookmarkStart w:id="19" w:name="_Toc196896490"/>
+      <w:bookmarkStart w:id="19" w:name="_Toc197215971"/>
       <w:r>
         <w:rPr>
           <w:rFonts w:hint="eastAsia"/>
@@ -10305,7 +10087,7 @@
         <w:pStyle w:val="3"/>
         <w:textAlignment w:val="baseline"/>
       </w:pPr>
-      <w:bookmarkStart w:id="20" w:name="_Toc196896491"/>
+      <w:bookmarkStart w:id="20" w:name="_Toc197215972"/>
       <w:r>
         <w:rPr>
           <w:rFonts w:hint="eastAsia"/>
@@ -10331,7 +10113,7 @@
         <w:pStyle w:val="3"/>
         <w:textAlignment w:val="baseline"/>
       </w:pPr>
-      <w:bookmarkStart w:id="21" w:name="_Toc196896492"/>
+      <w:bookmarkStart w:id="21" w:name="_Toc197215973"/>
       <w:r>
         <w:rPr>
           <w:rFonts w:hint="eastAsia"/>
@@ -10346,7 +10128,7 @@
         <w:spacing w:before="156" w:after="156"/>
         <w:textAlignment w:val="baseline"/>
       </w:pPr>
-      <w:bookmarkStart w:id="22" w:name="_Toc196896493"/>
+      <w:bookmarkStart w:id="22" w:name="_Toc197215974"/>
       <w:r>
         <w:rPr>
           <w:rFonts w:hint="eastAsia"/>
@@ -10372,7 +10154,7 @@
         <w:pStyle w:val="3"/>
         <w:textAlignment w:val="baseline"/>
       </w:pPr>
-      <w:bookmarkStart w:id="23" w:name="_Toc196896494"/>
+      <w:bookmarkStart w:id="23" w:name="_Toc197215975"/>
       <w:r>
         <w:rPr>
           <w:rFonts w:hint="eastAsia"/>
@@ -10404,7 +10186,7 @@
         <w:pStyle w:val="3"/>
         <w:textAlignment w:val="baseline"/>
       </w:pPr>
-      <w:bookmarkStart w:id="24" w:name="_Toc196896495"/>
+      <w:bookmarkStart w:id="24" w:name="_Toc197215976"/>
       <w:r>
         <w:rPr>
           <w:rFonts w:hint="eastAsia"/>
@@ -10436,7 +10218,7 @@
         <w:pStyle w:val="3"/>
         <w:textAlignment w:val="baseline"/>
       </w:pPr>
-      <w:bookmarkStart w:id="25" w:name="_Toc196896496"/>
+      <w:bookmarkStart w:id="25" w:name="_Toc197215977"/>
       <w:r>
         <w:rPr>
           <w:rFonts w:hint="eastAsia"/>
@@ -10469,7 +10251,7 @@
         <w:spacing w:before="156" w:after="156"/>
         <w:textAlignment w:val="baseline"/>
       </w:pPr>
-      <w:bookmarkStart w:id="26" w:name="_Toc196896497"/>
+      <w:bookmarkStart w:id="26" w:name="_Toc197215978"/>
       <w:r>
         <w:rPr>
           <w:rFonts w:hint="eastAsia"/>
@@ -10531,7 +10313,7 @@
         <w:pStyle w:val="3"/>
         <w:textAlignment w:val="baseline"/>
       </w:pPr>
-      <w:bookmarkStart w:id="27" w:name="_Toc196896498"/>
+      <w:bookmarkStart w:id="27" w:name="_Toc197215979"/>
       <w:r>
         <w:rPr>
           <w:rFonts w:hint="eastAsia"/>
@@ -10575,7 +10357,7 @@
         <w:pStyle w:val="3"/>
         <w:textAlignment w:val="baseline"/>
       </w:pPr>
-      <w:bookmarkStart w:id="28" w:name="_Toc196896499"/>
+      <w:bookmarkStart w:id="28" w:name="_Toc197215980"/>
       <w:r>
         <w:rPr>
           <w:rFonts w:hint="eastAsia"/>
@@ -10625,7 +10407,7 @@
         <w:pStyle w:val="3"/>
         <w:textAlignment w:val="baseline"/>
       </w:pPr>
-      <w:bookmarkStart w:id="29" w:name="_Toc196896500"/>
+      <w:bookmarkStart w:id="29" w:name="_Toc197215981"/>
       <w:r>
         <w:rPr>
           <w:rFonts w:hint="eastAsia"/>
@@ -10648,18 +10430,21 @@
         <w:rPr>
           <w:rFonts w:hint="eastAsia"/>
         </w:rPr>
-        <w:t>的分析目的</w:t>
+        <w:t>的分析</w:t>
+      </w:r>
+      <w:r>
+        <w:rPr>
+          <w:rFonts w:hint="eastAsia"/>
+        </w:rPr>
+        <w:t>设计</w:t>
       </w:r>
       <w:bookmarkEnd w:id="29"/>
     </w:p>
     <w:p>
       <w:pPr>
         <w:pStyle w:val="3"/>
-        <w:rPr>
-          <w:rFonts w:hint="eastAsia"/>
-        </w:rPr>
-      </w:pPr>
-      <w:bookmarkStart w:id="30" w:name="_Toc196896501"/>
+      </w:pPr>
+      <w:bookmarkStart w:id="30" w:name="_Toc197215982"/>
       <w:r>
         <w:rPr>
           <w:rFonts w:hint="eastAsia"/>
@@ -10682,7 +10467,13 @@
         <w:rPr>
           <w:rFonts w:hint="eastAsia"/>
         </w:rPr>
-        <w:t>的分析设计</w:t>
+        <w:t>的分析</w:t>
+      </w:r>
+      <w:r>
+        <w:rPr>
+          <w:rFonts w:hint="eastAsia"/>
+        </w:rPr>
+        <w:t>目的</w:t>
       </w:r>
       <w:bookmarkEnd w:id="30"/>
     </w:p>
@@ -10711,7 +10502,7 @@
         <w:ind w:firstLine="640"/>
         <w:textAlignment w:val="baseline"/>
       </w:pPr>
-      <w:bookmarkStart w:id="31" w:name="_Toc196896502"/>
+      <w:bookmarkStart w:id="31" w:name="_Toc197215983"/>
       <w:r>
         <w:rPr>
           <w:rFonts w:hint="eastAsia"/>
@@ -10727,7 +10518,7 @@
         <w:spacing w:before="156" w:after="156"/>
         <w:textAlignment w:val="baseline"/>
       </w:pPr>
-      <w:bookmarkStart w:id="32" w:name="_Toc196896503"/>
+      <w:bookmarkStart w:id="32" w:name="_Toc197215984"/>
       <w:r>
         <w:rPr>
           <w:rFonts w:hint="eastAsia"/>
@@ -10741,7 +10532,7 @@
         <w:pStyle w:val="3"/>
         <w:textAlignment w:val="baseline"/>
       </w:pPr>
-      <w:bookmarkStart w:id="33" w:name="_Toc196896504"/>
+      <w:bookmarkStart w:id="33" w:name="_Toc197215985"/>
       <w:r>
         <w:rPr>
           <w:rFonts w:hint="eastAsia"/>
@@ -10755,7 +10546,7 @@
         <w:pStyle w:val="3"/>
         <w:textAlignment w:val="baseline"/>
       </w:pPr>
-      <w:bookmarkStart w:id="34" w:name="_Toc196896505"/>
+      <w:bookmarkStart w:id="34" w:name="_Toc197215986"/>
       <w:r>
         <w:rPr>
           <w:rFonts w:hint="eastAsia"/>
@@ -10769,7 +10560,7 @@
         <w:pStyle w:val="3"/>
         <w:textAlignment w:val="baseline"/>
       </w:pPr>
-      <w:bookmarkStart w:id="35" w:name="_Toc196896506"/>
+      <w:bookmarkStart w:id="35" w:name="_Toc197215987"/>
       <w:r>
         <w:rPr>
           <w:rFonts w:hint="eastAsia"/>
@@ -10784,7 +10575,7 @@
         <w:spacing w:before="156" w:after="156"/>
         <w:textAlignment w:val="baseline"/>
       </w:pPr>
-      <w:bookmarkStart w:id="36" w:name="_Toc196896507"/>
+      <w:bookmarkStart w:id="36" w:name="_Toc197215988"/>
       <w:r>
         <w:rPr>
           <w:rFonts w:hint="eastAsia"/>
@@ -10804,7 +10595,7 @@
         <w:pStyle w:val="3"/>
         <w:textAlignment w:val="baseline"/>
       </w:pPr>
-      <w:bookmarkStart w:id="37" w:name="_Toc196896508"/>
+      <w:bookmarkStart w:id="37" w:name="_Toc197215989"/>
       <w:r>
         <w:rPr>
           <w:rFonts w:hint="eastAsia"/>
@@ -10830,60 +10621,111 @@
         <w:pStyle w:val="3"/>
         <w:textAlignment w:val="baseline"/>
       </w:pPr>
-      <w:bookmarkStart w:id="38" w:name="_Toc196896509"/>
-      <w:r>
-        <w:rPr>
-          <w:rFonts w:hint="eastAsia"/>
-        </w:rPr>
-        <w:t>确定与个体</w:t>
-      </w:r>
-      <w:r>
-        <w:rPr>
-          <w:rFonts w:hint="eastAsia"/>
-        </w:rPr>
-        <w:t>H3N2</w:t>
-      </w:r>
-      <w:r>
-        <w:rPr>
-          <w:rFonts w:hint="eastAsia"/>
-        </w:rPr>
-        <w:t>流感临界点有关的</w:t>
-      </w:r>
-      <w:r>
-        <w:rPr>
-          <w:rFonts w:hint="eastAsia"/>
-        </w:rPr>
-        <w:t>DNB</w:t>
-      </w:r>
-      <w:r>
-        <w:rPr>
-          <w:rFonts w:hint="eastAsia"/>
-        </w:rPr>
-        <w:t>模块</w:t>
+      <w:bookmarkStart w:id="38" w:name="_Toc197215990"/>
+      <w:r>
+        <w:rPr>
+          <w:rFonts w:hint="eastAsia"/>
+        </w:rPr>
+        <w:t>与临界点相关</w:t>
+      </w:r>
+      <w:r>
+        <w:t>DN</w:t>
+      </w:r>
+      <w:r>
+        <w:rPr>
+          <w:rFonts w:hint="eastAsia"/>
+        </w:rPr>
+        <w:t>B</w:t>
+      </w:r>
+      <w:r>
+        <w:rPr>
+          <w:rFonts w:hint="eastAsia"/>
+        </w:rPr>
+        <w:t>模块的</w:t>
+      </w:r>
+      <w:r>
+        <w:rPr>
+          <w:rFonts w:hint="eastAsia"/>
+        </w:rPr>
+        <w:t>GO</w:t>
+      </w:r>
+      <w:r>
+        <w:rPr>
+          <w:rFonts w:hint="eastAsia"/>
+        </w:rPr>
+        <w:t>与</w:t>
+      </w:r>
+      <w:r>
+        <w:rPr>
+          <w:rFonts w:hint="eastAsia"/>
+        </w:rPr>
+        <w:t>KEGG</w:t>
+      </w:r>
+      <w:r>
+        <w:rPr>
+          <w:rFonts w:hint="eastAsia"/>
+        </w:rPr>
+        <w:t>通路分析</w:t>
       </w:r>
       <w:bookmarkEnd w:id="38"/>
     </w:p>
     <w:p>
       <w:pPr>
-        <w:pStyle w:val="3"/>
+        <w:pStyle w:val="2"/>
+        <w:spacing w:before="156" w:after="156"/>
         <w:textAlignment w:val="baseline"/>
       </w:pPr>
-      <w:bookmarkStart w:id="39" w:name="_Toc196896510"/>
-      <w:r>
-        <w:rPr>
-          <w:rFonts w:hint="eastAsia"/>
-        </w:rPr>
-        <w:t>与临界点相关生物标志物与通路分析</w:t>
+      <w:bookmarkStart w:id="39" w:name="_Toc197215991"/>
+      <w:r>
+        <w:rPr>
+          <w:rFonts w:hint="eastAsia"/>
+        </w:rPr>
+        <w:t>TCGA-</w:t>
+      </w:r>
+      <w:r>
+        <w:rPr>
+          <w:rFonts w:hint="eastAsia"/>
+        </w:rPr>
+        <w:t>READ</w:t>
+      </w:r>
+      <w:r>
+        <w:rPr>
+          <w:rFonts w:hint="eastAsia"/>
+        </w:rPr>
+        <w:t>与</w:t>
+      </w:r>
+      <w:r>
+        <w:rPr>
+          <w:rFonts w:hint="eastAsia"/>
+        </w:rPr>
+        <w:t>TCGA-</w:t>
+      </w:r>
+      <w:r>
+        <w:rPr>
+          <w:rFonts w:hint="eastAsia"/>
+        </w:rPr>
+        <w:t>COAD</w:t>
+      </w:r>
+      <w:r>
+        <w:rPr>
+          <w:rFonts w:hint="eastAsia"/>
+        </w:rPr>
+        <w:t>的因果网络熵分析结果</w:t>
       </w:r>
       <w:bookmarkEnd w:id="39"/>
     </w:p>
     <w:p>
       <w:pPr>
-        <w:pStyle w:val="2"/>
-        <w:spacing w:before="156" w:after="156"/>
+        <w:pStyle w:val="3"/>
         <w:textAlignment w:val="baseline"/>
       </w:pPr>
-      <w:bookmarkStart w:id="40" w:name="_Toc196896511"/>
+      <w:bookmarkStart w:id="40" w:name="_Toc197215992"/>
+      <w:r>
+        <w:rPr>
+          <w:rFonts w:hint="eastAsia"/>
+        </w:rPr>
+        <w:t>识别</w:t>
+      </w:r>
       <w:r>
         <w:rPr>
           <w:rFonts w:hint="eastAsia"/>
@@ -10894,13 +10736,19 @@
         <w:rPr>
           <w:rFonts w:hint="eastAsia"/>
         </w:rPr>
-        <w:t>READ</w:t>
-      </w:r>
-      <w:r>
-        <w:rPr>
-          <w:rFonts w:hint="eastAsia"/>
-        </w:rPr>
-        <w:t>与</w:t>
+        <w:t>REA</w:t>
+      </w:r>
+      <w:r>
+        <w:rPr>
+          <w:rFonts w:hint="eastAsia"/>
+        </w:rPr>
+        <w:t>D</w:t>
+      </w:r>
+      <w:r>
+        <w:rPr>
+          <w:rFonts w:hint="eastAsia"/>
+        </w:rPr>
+        <w:t>及</w:t>
       </w:r>
       <w:r>
         <w:rPr>
@@ -10912,13 +10760,19 @@
         <w:rPr>
           <w:rFonts w:hint="eastAsia"/>
         </w:rPr>
-        <w:t>COAD</w:t>
-      </w:r>
-      <w:r>
-        <w:rPr>
-          <w:rFonts w:hint="eastAsia"/>
-        </w:rPr>
-        <w:t>的因果网络熵分析结果</w:t>
+        <w:t>CO</w:t>
+      </w:r>
+      <w:r>
+        <w:rPr>
+          <w:rFonts w:hint="eastAsia"/>
+        </w:rPr>
+        <w:t>AD</w:t>
+      </w:r>
+      <w:r>
+        <w:rPr>
+          <w:rFonts w:hint="eastAsia"/>
+        </w:rPr>
+        <w:t>的恶化前状态的分期阶段</w:t>
       </w:r>
       <w:bookmarkEnd w:id="40"/>
     </w:p>
@@ -10927,150 +10781,14 @@
         <w:pStyle w:val="3"/>
         <w:textAlignment w:val="baseline"/>
       </w:pPr>
-      <w:bookmarkStart w:id="41" w:name="_Toc196896512"/>
-      <w:r>
-        <w:rPr>
-          <w:rFonts w:hint="eastAsia"/>
-        </w:rPr>
-        <w:t>识别</w:t>
-      </w:r>
-      <w:r>
-        <w:rPr>
-          <w:rFonts w:hint="eastAsia"/>
-        </w:rPr>
-        <w:t>TCGA-</w:t>
-      </w:r>
-      <w:r>
-        <w:rPr>
-          <w:rFonts w:hint="eastAsia"/>
-        </w:rPr>
-        <w:t>REA</w:t>
-      </w:r>
-      <w:r>
-        <w:rPr>
-          <w:rFonts w:hint="eastAsia"/>
-        </w:rPr>
-        <w:t>D</w:t>
-      </w:r>
-      <w:r>
-        <w:rPr>
-          <w:rFonts w:hint="eastAsia"/>
-        </w:rPr>
-        <w:t>及</w:t>
-      </w:r>
-      <w:r>
-        <w:rPr>
-          <w:rFonts w:hint="eastAsia"/>
-        </w:rPr>
-        <w:t>TCGA-</w:t>
-      </w:r>
-      <w:r>
-        <w:rPr>
-          <w:rFonts w:hint="eastAsia"/>
-        </w:rPr>
-        <w:t>CO</w:t>
-      </w:r>
-      <w:r>
-        <w:rPr>
-          <w:rFonts w:hint="eastAsia"/>
-        </w:rPr>
-        <w:t>AD</w:t>
-      </w:r>
-      <w:r>
-        <w:rPr>
-          <w:rFonts w:hint="eastAsia"/>
-        </w:rPr>
-        <w:t>的恶化前状态的分期阶段</w:t>
+      <w:bookmarkStart w:id="41" w:name="_Toc197215993"/>
+      <w:r>
+        <w:rPr>
+          <w:rFonts w:hint="eastAsia"/>
+        </w:rPr>
+        <w:t>临界点前后的生存差异</w:t>
       </w:r>
       <w:bookmarkEnd w:id="41"/>
-    </w:p>
-    <w:p>
-      <w:pPr>
-        <w:pStyle w:val="3"/>
-        <w:textAlignment w:val="baseline"/>
-      </w:pPr>
-      <w:bookmarkStart w:id="42" w:name="_Toc196896513"/>
-      <w:r>
-        <w:rPr>
-          <w:rFonts w:hint="eastAsia"/>
-        </w:rPr>
-        <w:t>确定与</w:t>
-      </w:r>
-      <w:r>
-        <w:rPr>
-          <w:rFonts w:hint="eastAsia"/>
-        </w:rPr>
-        <w:t>TCGA-</w:t>
-      </w:r>
-      <w:r>
-        <w:rPr>
-          <w:rFonts w:hint="eastAsia"/>
-        </w:rPr>
-        <w:t>RE</w:t>
-      </w:r>
-      <w:r>
-        <w:rPr>
-          <w:rFonts w:hint="eastAsia"/>
-        </w:rPr>
-        <w:t>AD</w:t>
-      </w:r>
-      <w:r>
-        <w:rPr>
-          <w:rFonts w:hint="eastAsia"/>
-        </w:rPr>
-        <w:t>及</w:t>
-      </w:r>
-      <w:r>
-        <w:rPr>
-          <w:rFonts w:hint="eastAsia"/>
-        </w:rPr>
-        <w:t>TCGA-</w:t>
-      </w:r>
-      <w:r>
-        <w:rPr>
-          <w:rFonts w:hint="eastAsia"/>
-        </w:rPr>
-        <w:t>CO</w:t>
-      </w:r>
-      <w:r>
-        <w:rPr>
-          <w:rFonts w:hint="eastAsia"/>
-        </w:rPr>
-        <w:t>AD</w:t>
-      </w:r>
-      <w:r>
-        <w:rPr>
-          <w:rFonts w:hint="eastAsia"/>
-        </w:rPr>
-        <w:t>临界点有关的</w:t>
-      </w:r>
-      <w:r>
-        <w:rPr>
-          <w:rFonts w:hint="eastAsia"/>
-        </w:rPr>
-        <w:t>DNB</w:t>
-      </w:r>
-      <w:r>
-        <w:rPr>
-          <w:rFonts w:hint="eastAsia"/>
-        </w:rPr>
-        <w:t>模块</w:t>
-      </w:r>
-      <w:bookmarkEnd w:id="42"/>
-    </w:p>
-    <w:p>
-      <w:pPr>
-        <w:pStyle w:val="3"/>
-        <w:textAlignment w:val="baseline"/>
-      </w:pPr>
-      <w:bookmarkStart w:id="43" w:name="_Toc196896514"/>
-      <w:r>
-        <w:rPr>
-          <w:rFonts w:hint="eastAsia"/>
-        </w:rPr>
-        <w:t>临界点前后的生存差异</w:t>
-      </w:r>
-      <w:bookmarkEnd w:id="43"/>
     </w:p>
     <w:p>
       <w:pPr>
@@ -11083,14 +10801,50 @@
           <w:docGrid w:type="lines" w:linePitch="312"/>
         </w:sectPr>
       </w:pPr>
-      <w:bookmarkStart w:id="44" w:name="_Toc196896515"/>
-      <w:r>
-        <w:rPr>
-          <w:rFonts w:hint="eastAsia"/>
-        </w:rPr>
-        <w:t>与临界点相关生物标志物与通路分析</w:t>
-      </w:r>
-      <w:bookmarkEnd w:id="44"/>
+      <w:bookmarkStart w:id="42" w:name="_Toc197215994"/>
+      <w:r>
+        <w:rPr>
+          <w:rFonts w:hint="eastAsia"/>
+        </w:rPr>
+        <w:t>与临界点相关</w:t>
+      </w:r>
+      <w:r>
+        <w:rPr>
+          <w:rFonts w:hint="eastAsia"/>
+        </w:rPr>
+        <w:t>DNB</w:t>
+      </w:r>
+      <w:r>
+        <w:rPr>
+          <w:rFonts w:hint="eastAsia"/>
+        </w:rPr>
+        <w:t>模块的</w:t>
+      </w:r>
+      <w:r>
+        <w:rPr>
+          <w:rFonts w:hint="eastAsia"/>
+        </w:rPr>
+        <w:t>GO</w:t>
+      </w:r>
+      <w:r>
+        <w:rPr>
+          <w:rFonts w:hint="eastAsia"/>
+        </w:rPr>
+        <w:t>与</w:t>
+      </w:r>
+      <w:r>
+        <w:rPr>
+          <w:rFonts w:hint="eastAsia"/>
+        </w:rPr>
+        <w:t>KEGG</w:t>
+      </w:r>
+      <w:r>
+        <w:rPr>
+          <w:rFonts w:hint="eastAsia"/>
+        </w:rPr>
+        <w:t>通路分析</w:t>
+      </w:r>
+      <w:bookmarkEnd w:id="42"/>
     </w:p>
     <w:p>
       <w:pPr>
@@ -11108,7 +10862,7 @@
           <w:docGrid w:type="lines" w:linePitch="312"/>
         </w:sectPr>
       </w:pPr>
-      <w:bookmarkStart w:id="45" w:name="_Toc196896516"/>
+      <w:bookmarkStart w:id="43" w:name="_Toc197215995"/>
       <w:r>
         <w:rPr>
           <w:rFonts w:hint="eastAsia"/>
@@ -11116,21 +10870,21 @@
         <w:lastRenderedPageBreak/>
         <w:t>论文总结</w:t>
       </w:r>
-      <w:bookmarkEnd w:id="45"/>
+      <w:bookmarkEnd w:id="43"/>
     </w:p>
     <w:p>
       <w:pPr>
         <w:pStyle w:val="af"/>
         <w:textAlignment w:val="baseline"/>
       </w:pPr>
-      <w:bookmarkStart w:id="46" w:name="_Toc196141866"/>
-      <w:bookmarkStart w:id="47" w:name="_Toc196896517"/>
+      <w:bookmarkStart w:id="44" w:name="_Toc196141866"/>
+      <w:bookmarkStart w:id="45" w:name="_Toc197215996"/>
       <w:r>
         <w:lastRenderedPageBreak/>
         <w:t>参考文献</w:t>
       </w:r>
-      <w:bookmarkEnd w:id="46"/>
-      <w:bookmarkEnd w:id="47"/>
+      <w:bookmarkEnd w:id="44"/>
+      <w:bookmarkEnd w:id="45"/>
     </w:p>
     <w:p>
       <w:pPr>
@@ -11156,8 +10910,8 @@
         <w:pStyle w:val="af"/>
         <w:textAlignment w:val="baseline"/>
       </w:pPr>
-      <w:bookmarkStart w:id="48" w:name="_Toc196141867"/>
-      <w:bookmarkStart w:id="49" w:name="_Toc196896518"/>
+      <w:bookmarkStart w:id="46" w:name="_Toc196141867"/>
+      <w:bookmarkStart w:id="47" w:name="_Toc197215997"/>
       <w:r>
         <w:rPr>
           <w:rFonts w:hint="eastAsia"/>
@@ -11173,8 +10927,8 @@
         </w:rPr>
         <w:t>谢</w:t>
       </w:r>
-      <w:bookmarkEnd w:id="48"/>
-      <w:bookmarkEnd w:id="49"/>
+      <w:bookmarkEnd w:id="46"/>
+      <w:bookmarkEnd w:id="47"/>
     </w:p>
     <w:sectPr>
       <w:pgSz w:w="11906" w:h="16838"/>
@@ -13486,7 +13240,7 @@
     <w:qFormat/>
     <w:rsid w:val="0083619E"/>
     <w:rPr>
-      <w:rFonts w:ascii="等线" w:eastAsia="等线" w:hAnsi="等线"/>
+      <w:rFonts w:ascii="DengXian" w:eastAsia="DengXian" w:hAnsi="DengXian"/>
       <w:kern w:val="2"/>
       <w:sz w:val="21"/>
       <w:szCs w:val="22"/>

</xml_diff>